<commit_message>
Book 2 Ch1: Merge Ch2 opening, tighten prose, retitle to 'Assigned to Witness'
</commit_message>
<xml_diff>
--- a/manuscript/chapter-02-unassigned.docx
+++ b/manuscript/chapter-02-unassigned.docx
@@ -17,7 +17,7 @@
     </w:p>
     <w:p>
       <w:r>
-        <w:t>No one moved. The four monitors stood frozen, watching the display as if the queue might resolve itself if they waited long enough. In Trinity, problems that didn't fit the categories often disappeared if you simply didn't acknowledge them. But this one wasn't disappearing.</w:t>
+        <w:t>No one moved. The four monitors stood frozen, watching the display as if the queue might resolve itself if they waited long enough. In Trinity, problems that didn't fit the categories were usually managed by not naming them at all. The system preferred clean labels to inconvenient facts. But this one refused to be ignored.</w:t>
       </w:r>
     </w:p>
     <w:p>
@@ -32,12 +32,12 @@
     </w:p>
     <w:p>
       <w:r>
-        <w:t>Daren moved first with the efficient certainty of someone who believed problems were problems and people were data points to organize. He spoke their names loudly, his voice carrying that particular disdain his gana was well known for.</w:t>
+        <w:t>Daren moved first with the efficient certainty of someone who believed problems were problems and people were data points to organize. He spoke their names loudly, his voice carrying that particular disdain his gana was known for.</w:t>
       </w:r>
     </w:p>
     <w:p>
       <w:r>
-        <w:t>"Well, looks like we have some unassigned losers here," he said. "Gage, Otto, and Ben. Let's just say that all their last names are don't matter."</w:t>
+        <w:t>"Well, looks like we have some unassigned losers here," he said. "Gage, Otto, and Ben. Let's just say all their last names are don't matter."</w:t>
       </w:r>
     </w:p>
     <w:p>
@@ -47,7 +47,7 @@
     </w:p>
     <w:p>
       <w:r>
-        <w:t>Elara pulled up the detailed profile of each of the three unassigned Initiation candidates. The screens filled with data—medical scans, behavioral histories, genetic markers, skill assessments. Thousands of points of measurement, each one designed to fit a person into a category. But these three didn't fit. In Trinity, the only way to do the work of Trinity was to stop seeing the work as something done to people. She pulled up their files and began to look for the pattern that would explain why the system had rejected them. It was easier this way. Easier to see them as problems to solve than as people waiting to be sorted into Trinity's preferred categories. Easier, and also safer.</w:t>
+        <w:t>Elara pulled up the detailed profile of each of the three unassigned Initiation candidates. The screens filled with data—medical scans, behavioral histories, genetic markers, skill assessments. Thousands of points of measurement, each one designed to fit a person into a category. But these three didn't fit. In Trinity, the only way to do the work of Trinity was to stop seeing the work as something done to people. She pulled up their files and began to look for the pattern that would explain why the system had rejected them. It was easier this way. Easier to see them as problems to solve than as people waiting to be sorted into Trinity's preferred categories. Easier, and safer.</w:t>
       </w:r>
     </w:p>
     <w:p>
@@ -57,7 +57,7 @@
     </w:p>
     <w:p>
       <w:r>
-        <w:t>Rohan heard Elara and simply complied. He had read the debrief that morning and knew that Elara was the lead for their group. There was a hierarchy even here, in this room where the four ganas were supposed to balance each other, and Elara had earned her authority through excellence. He recognized that and moved out of the way without objection.</w:t>
+        <w:t>Rohan heard Elara and simply complied. He had read the debrief that morning and knew she was the lead for their group. There was a hierarchy even here, in this room where the four ganas were supposed to balance each other, and Elara had earned her authority through excellence. He recognized that and moved out of the way without objection.</w:t>
       </w:r>
     </w:p>
     <w:p>
@@ -67,7 +67,7 @@
     </w:p>
     <w:p>
       <w:r>
-        <w:t>Elara pulled up Gage's profile and the data rendered itself on the screen like a description of someone's worth. She started reading through loudly, her voice steady and clinical.</w:t>
+        <w:t>Elara pulled up Gage's profile and the data rendered itself on the screen like a description of someone's worth. She started reading aloud, her voice steady and clinical.</w:t>
       </w:r>
     </w:p>
     <w:p>
@@ -77,27 +77,17 @@
     </w:p>
     <w:p>
       <w:r>
-        <w:t>She glanced up from the display. The numbers registered as anomalies before they registered as anything else. In Miner Town, where resources were strictly rationed and bodies were built for specific work, a person that size shouldn't exist. Shouldn't be possible.</w:t>
+        <w:t>She glanced up from the display. The figures hit her before the person did: too large for the ration, too heavy for the work, too impossible for the system to explain in one glance. In Miner Town, where resources were strictly rationed and bodies were built for specific work, a person that size shouldn't exist. Shouldn't be possible.</w:t>
       </w:r>
     </w:p>
     <w:p>
       <w:r>
-        <w:t>"Well, looks like we have a big one on our hands."</w:t>
+        <w:t>"Wow. I didn't know there were teenagers that big anywhere, let alone in Trinity. How does he get that big on starch cubes alone?"</w:t>
       </w:r>
     </w:p>
     <w:p>
       <w:r>
-        <w:t>She paused, reading further into the physical and background data. The numbers became stranger with each line.</w:t>
-      </w:r>
-    </w:p>
-    <w:p>
-      <w:r>
-        <w:t>"Wow. I didn't know that there were teenagers that big anywhere, let alone in Trinity. How does he get that big on starch cubes alone?"</w:t>
-      </w:r>
-    </w:p>
-    <w:p>
-      <w:r>
-        <w:t>It was a genuine question—the kind of question that revealed a gap in her understanding of how the system actually worked. She looked around at the other three monitors, and in that moment of asking, she was no longer simply assigning data points. She was wondering about a person.</w:t>
+        <w:t>It was a genuine question—the kind that revealed a gap in her understanding of how the system actually worked. She looked around at the other three monitors, and in that moment of asking, she was no longer simply assigning data points. She was wondering about a person.</w:t>
       </w:r>
     </w:p>
     <w:p>
@@ -107,7 +97,7 @@
     </w:p>
     <w:p>
       <w:r>
-        <w:t>Everyone nodded. They just failed to see the need for any excitement or fascination with a lowly miner. But Elara saw it. Or at least, some part of her did. She pushed it down, buried it under the weight of protocol, and claimed him as hers.</w:t>
+        <w:t>Everyone nodded. They didn't see the need for excitement or fascination with a lowly miner. But Elara saw it. Or at least some part of her did. She pushed it down, buried it under protocol, and claimed him as hers.</w:t>
       </w:r>
     </w:p>
     <w:p>
@@ -122,12 +112,12 @@
     </w:p>
     <w:p>
       <w:r>
-        <w:t>She glanced across the room. "Well, now that's more like it. Your average joe. Anyone would like to volunteer to cater to this fine gentleman?"</w:t>
+        <w:t>She glanced across the room. "Well, now that's more like it. Your average joe. Anyone want to volunteer to cater to this fine gentleman?"</w:t>
       </w:r>
     </w:p>
     <w:p>
       <w:r>
-        <w:t>Rowan's hand moved before he fully understood why. It was instinct, the professional recognition of his domain. He knew better than any of them that the average joe is who often sets the tone of the masses. That's what he specialized in—understanding how ordinary people ripple through a system, how the baseline becomes the rule. A miner with those measurements had learned to move efficiently, conserving energy, building controlled strength. The kind of discipline that kept the deep shafts functioning without strain. Ben wasn't exceptional—which was exactly why he mattered. He was the standard Trinity built its foundation on. The necessary normal.</w:t>
+        <w:t>Rowan's hand moved before he fully understood why. It was instinct, the professional recognition of his domain. He knew better than any of them that the average miner was the true governing force in any system. The majority set the rhythm, absorbed the pressure, and kept the machinery running. That was the Chanakya way: study the many, understand the mainstream, and use that understanding to decide where the system would bend and where it would break. Ben's measurements were ordinary in the most important sense. They were not the exception. They were the baseline. The kind of disciplined, efficient build that kept the deep shafts moving without noise or collapse. That was why Ben interested him. Not because Ben was remarkable, but because Ben was representative.</w:t>
       </w:r>
     </w:p>
     <w:p>
@@ -157,12 +147,12 @@
     </w:p>
     <w:p>
       <w:r>
-        <w:t>"On the surface, he's no different from Ben."</w:t>
+        <w:t>"On the surface, he's no different from Ben. The Trinity scanner is showing an abnormally high energy signature."</w:t>
       </w:r>
     </w:p>
     <w:p>
       <w:r>
-        <w:t>Before she could move to the next assignment, Rohan stood up from the CORRECTION console.</w:t>
+        <w:t>Before Elara could move to the next assignment, or even finish the thought that had just surfaced in her mind—reading error, hidden variable, or something singular in this individual—Rohan was already on his feet, one hand raised from the CORRECTION console.</w:t>
       </w:r>
     </w:p>
     <w:p>
@@ -172,12 +162,12 @@
     </w:p>
     <w:p>
       <w:r>
-        <w:t>Which was funny, because the chances of any of them actually interacting, let alone meeting any of the Initiation candidates, was considered zero. But Rohan's excitement, although seemingly misplaced, was not odd. Their routine days gave little to no space for any excitement, and this—claiming someone to examine—was as close as Rohan was going to get today. The Ashoka representative was being drawn to anomaly, to something that didn't fit the expected categories.</w:t>
+        <w:t>It was a strange reaction, given the chances of any of them actually interacting with, let alone meeting, an Initiation candidate were considered effectively zero. But Rohan's excitement, although seemingly misplaced, was not odd. Their routine days offered little room for any excitement, and this—claiming someone to examine—was as close as Rohan was going to get today. The Ashoka representative was being drawn toward the outlier, the unreadable fact, the person who didn't fit the expected categories.</w:t>
       </w:r>
     </w:p>
     <w:p>
       <w:r>
-        <w:t>That was what they all felt, if they were honest about it. That pull toward the exception. That hunger for something that wasn't predictable.</w:t>
+        <w:t>That was what they all felt, if they were honest about it. The pull toward the exception. The hunger for something that wasn't predictable.</w:t>
       </w:r>
     </w:p>
     <w:p>
@@ -187,27 +177,27 @@
     </w:p>
     <w:p>
       <w:r>
-        <w:t>Elara paused, her eyes narrowing at the readout. There was something here that required attention. Something that changed the game.</w:t>
+        <w:t>As Rohan assigned Otto to himself and started looking at him more closely, he paused, his eyes narrowing at the readout. There was something here that required attention. Something that changed the game.</w:t>
       </w:r>
     </w:p>
     <w:p>
       <w:r>
-        <w:t>"But here is the kicker. Body fat percentage is three percent."</w:t>
+        <w:t>The silence that followed wasn't casual. It was the silence of recognition. Trinity's baseline readings were designed to be stable, predictable, and easy to classify. An energy surge that high on the initiation monitor wasn't a normal physiological deviation. It was a signal. And signals like that didn't just appear in the middle of a routine intake.</w:t>
       </w:r>
     </w:p>
     <w:p>
       <w:r>
-        <w:t>The silence that followed wasn't casual. It was the silence of recognition. Three percent was shredded. Starved. While Trinity wasn't exactly serving ice cream and fun in Miner Town, three percent body fat was extraordinarily low even by their standards. That level of lean wasn't something you achieved on starch cubes and controlled rations. That required deliberation. That was intention married to discipline, and discipline married to something else entirely. Obsession. Or rage. Or both.</w:t>
+        <w:t>Rohan leaned forward, the room's usual boredom evaporating in an instant. "That kind of spike? That's not a diet issue. That's a system fault."</w:t>
       </w:r>
     </w:p>
     <w:p>
       <w:r>
-        <w:t>"He must be absolutely shredded underneath," Elara said quietly.</w:t>
+        <w:t>Elara's eyes stayed on the screen. "He wasn't just built differently. The scanner is reading him almost like an energy source."</w:t>
       </w:r>
     </w:p>
     <w:p>
       <w:r>
-        <w:t>The words hung in the air like a question no one wanted to answer: What kind of person gets that lean in Miner Town? And what does it mean that the system couldn't categorize him once it saw what he really was?</w:t>
+        <w:t>The room didn't answer. It simply held the implication in place: if the monitoring team was already surprised, then whatever was happening in Otto's intake was not a routine anomaly. It was the kind of reading that made people rethink the system itself.</w:t>
       </w:r>
     </w:p>
     <w:sectPr>

</xml_diff>